<commit_message>
essencial receitas caso expandido
</commit_message>
<xml_diff>
--- a/essencial receitas.docx
+++ b/essencial receitas.docx
@@ -317,7 +317,7 @@
           <w:szCs w:val="24"/>
           <w:rtl w:val="0"/>
         </w:rPr>
-        <w:t xml:space="preserve"> Prof.norberto</w:t>
+        <w:t xml:space="preserve"> Prof.norbertoa</w:t>
       </w:r>
     </w:p>
     <w:p>
@@ -7301,48 +7301,132 @@
           </w:tcPr>
           <w:p>
             <w:pPr>
-              <w:spacing w:after="420" w:before="180" w:line="360" w:lineRule="auto"/>
-              <w:ind w:left="0" w:firstLine="0"/>
-              <w:rPr>
-                <w:sz w:val="24"/>
-                <w:szCs w:val="24"/>
-              </w:rPr>
-            </w:pPr>
-            <w:r>
-              <w:rPr>
-                <w:rtl w:val="0"/>
-              </w:rPr>
-            </w:r>
-          </w:p>
-          <w:p>
-            <w:pPr>
-              <w:widowControl w:val="0"/>
-              <w:spacing w:line="240" w:lineRule="auto"/>
-              <w:ind w:left="0" w:firstLine="0"/>
-              <w:rPr>
-                <w:sz w:val="24"/>
-                <w:szCs w:val="24"/>
-              </w:rPr>
-            </w:pPr>
-            <w:r>
-              <w:rPr>
-                <w:rtl w:val="0"/>
-              </w:rPr>
-            </w:r>
-          </w:p>
-          <w:p>
-            <w:pPr>
-              <w:widowControl w:val="0"/>
-              <w:spacing w:line="240" w:lineRule="auto"/>
-              <w:rPr>
-                <w:sz w:val="24"/>
-                <w:szCs w:val="24"/>
-              </w:rPr>
-            </w:pPr>
-            <w:r>
-              <w:rPr>
-                <w:rtl w:val="0"/>
-              </w:rPr>
+              <w:numPr>
+                <w:ilvl w:val="0"/>
+                <w:numId w:val="8"/>
+              </w:numPr>
+              <w:spacing w:after="0" w:afterAutospacing="0" w:before="180" w:line="360" w:lineRule="auto"/>
+              <w:ind w:left="720" w:hanging="360"/>
+            </w:pPr>
+            <w:r>
+              <w:rPr>
+                <w:b w:val="1"/>
+                <w:bCs w:val="1"/>
+                <w:sz w:val="24"/>
+                <w:szCs w:val="24"/>
+                <w:rtl w:val="0"/>
+              </w:rPr>
+              <w:t xml:space="preserve">Fluxo Alternativo 2a: Permissão de GPS negada pelo usuário</w:t>
+            </w:r>
+          </w:p>
+          <w:p>
+            <w:pPr>
+              <w:numPr>
+                <w:ilvl w:val="1"/>
+                <w:numId w:val="8"/>
+              </w:numPr>
+              <w:spacing w:after="0" w:afterAutospacing="0" w:before="0" w:beforeAutospacing="0" w:line="360" w:lineRule="auto"/>
+              <w:ind w:left="1440" w:hanging="360"/>
+            </w:pPr>
+            <w:r>
+              <w:rPr>
+                <w:sz w:val="24"/>
+                <w:szCs w:val="24"/>
+                <w:rtl w:val="0"/>
+              </w:rPr>
+              <w:t xml:space="preserve">O sistema identifica que a permissão de localização foi recusada.</w:t>
+            </w:r>
+          </w:p>
+          <w:p>
+            <w:pPr>
+              <w:numPr>
+                <w:ilvl w:val="1"/>
+                <w:numId w:val="8"/>
+              </w:numPr>
+              <w:spacing w:after="0" w:afterAutospacing="0" w:before="0" w:beforeAutospacing="0" w:line="360" w:lineRule="auto"/>
+              <w:ind w:left="1440" w:hanging="360"/>
+            </w:pPr>
+            <w:r>
+              <w:rPr>
+                <w:sz w:val="24"/>
+                <w:szCs w:val="24"/>
+                <w:rtl w:val="0"/>
+              </w:rPr>
+              <w:t xml:space="preserve">O sistema exibe uma mensagem solicitando que o Cliente insira um endereço manualmente (Ex: CEP ou Nome da Rua).</w:t>
+            </w:r>
+          </w:p>
+          <w:p>
+            <w:pPr>
+              <w:numPr>
+                <w:ilvl w:val="1"/>
+                <w:numId w:val="8"/>
+              </w:numPr>
+              <w:spacing w:after="0" w:afterAutospacing="0" w:before="0" w:beforeAutospacing="0" w:line="360" w:lineRule="auto"/>
+              <w:ind w:left="1440" w:hanging="360"/>
+            </w:pPr>
+            <w:r>
+              <w:rPr>
+                <w:sz w:val="24"/>
+                <w:szCs w:val="24"/>
+                <w:rtl w:val="0"/>
+              </w:rPr>
+              <w:t xml:space="preserve">O Cliente insira o endereço.</w:t>
+            </w:r>
+          </w:p>
+          <w:p>
+            <w:pPr>
+              <w:numPr>
+                <w:ilvl w:val="1"/>
+                <w:numId w:val="8"/>
+              </w:numPr>
+              <w:spacing w:after="0" w:afterAutospacing="0" w:before="0" w:beforeAutospacing="0" w:line="360" w:lineRule="auto"/>
+              <w:ind w:left="1440" w:hanging="360"/>
+            </w:pPr>
+            <w:r>
+              <w:rPr>
+                <w:sz w:val="24"/>
+                <w:szCs w:val="24"/>
+                <w:rtl w:val="0"/>
+              </w:rPr>
+              <w:t xml:space="preserve">O sistema valida o endereço e prossegue para o passo 4 do fluxo principal.</w:t>
+            </w:r>
+          </w:p>
+          <w:p>
+            <w:pPr>
+              <w:numPr>
+                <w:ilvl w:val="0"/>
+                <w:numId w:val="8"/>
+              </w:numPr>
+              <w:spacing w:after="0" w:afterAutospacing="0" w:before="0" w:beforeAutospacing="0" w:line="360" w:lineRule="auto"/>
+              <w:ind w:left="720" w:hanging="360"/>
+            </w:pPr>
+            <w:r>
+              <w:rPr>
+                <w:b w:val="1"/>
+                <w:bCs w:val="1"/>
+                <w:sz w:val="24"/>
+                <w:szCs w:val="24"/>
+                <w:rtl w:val="0"/>
+              </w:rPr>
+              <w:t xml:space="preserve">Fluxo de Exceção 3a: Baixa precisão do sinal de GPS (Raio maior que 50 metros)</w:t>
+            </w:r>
+          </w:p>
+          <w:p>
+            <w:pPr>
+              <w:numPr>
+                <w:ilvl w:val="1"/>
+                <w:numId w:val="8"/>
+              </w:numPr>
+              <w:spacing w:after="840" w:before="0" w:beforeAutospacing="0" w:line="360" w:lineRule="auto"/>
+              <w:ind w:left="1440" w:hanging="360"/>
+            </w:pPr>
+            <w:r>
+              <w:rPr>
+                <w:sz w:val="24"/>
+                <w:szCs w:val="24"/>
+                <w:rtl w:val="0"/>
+              </w:rPr>
+              <w:t xml:space="preserve">O sistema detecta que o sinal do GPS está fraco ou impreciso.</w:t>
             </w:r>
           </w:p>
         </w:tc>
@@ -7399,19 +7483,94 @@
           </w:tcPr>
           <w:p>
             <w:pPr>
-              <w:spacing w:after="420" w:before="180" w:line="360" w:lineRule="auto"/>
-              <w:ind w:left="0" w:firstLine="0"/>
-              <w:rPr>
-                <w:b w:val="1"/>
-                <w:bCs w:val="1"/>
-                <w:sz w:val="24"/>
-                <w:szCs w:val="24"/>
-              </w:rPr>
-            </w:pPr>
-            <w:r>
-              <w:rPr>
-                <w:rtl w:val="0"/>
-              </w:rPr>
+              <w:numPr>
+                <w:ilvl w:val="0"/>
+                <w:numId w:val="8"/>
+              </w:numPr>
+              <w:spacing w:after="0" w:afterAutospacing="0" w:before="180" w:line="360" w:lineRule="auto"/>
+              <w:ind w:left="720" w:hanging="360"/>
+            </w:pPr>
+            <w:r>
+              <w:rPr>
+                <w:b w:val="1"/>
+                <w:bCs w:val="1"/>
+                <w:sz w:val="24"/>
+                <w:szCs w:val="24"/>
+                <w:rtl w:val="0"/>
+              </w:rPr>
+              <w:t xml:space="preserve">Fluxo Alternativo 2a: Permissão de GPS negada pelo usuário</w:t>
+            </w:r>
+          </w:p>
+          <w:p>
+            <w:pPr>
+              <w:numPr>
+                <w:ilvl w:val="1"/>
+                <w:numId w:val="8"/>
+              </w:numPr>
+              <w:spacing w:after="0" w:afterAutospacing="0" w:before="0" w:beforeAutospacing="0" w:line="360" w:lineRule="auto"/>
+              <w:ind w:left="1440" w:hanging="360"/>
+            </w:pPr>
+            <w:r>
+              <w:rPr>
+                <w:sz w:val="24"/>
+                <w:szCs w:val="24"/>
+                <w:rtl w:val="0"/>
+              </w:rPr>
+              <w:t xml:space="preserve">O sistema identifica que a permissão de localização foi recusada.</w:t>
+            </w:r>
+          </w:p>
+          <w:p>
+            <w:pPr>
+              <w:numPr>
+                <w:ilvl w:val="1"/>
+                <w:numId w:val="8"/>
+              </w:numPr>
+              <w:spacing w:after="0" w:afterAutospacing="0" w:before="0" w:beforeAutospacing="0" w:line="360" w:lineRule="auto"/>
+              <w:ind w:left="1440" w:hanging="360"/>
+            </w:pPr>
+            <w:r>
+              <w:rPr>
+                <w:sz w:val="24"/>
+                <w:szCs w:val="24"/>
+                <w:rtl w:val="0"/>
+              </w:rPr>
+              <w:t xml:space="preserve">O sistema exibe uma mensagem solicitando que o Cliente insira um endereço manualmente (Ex: CEP ou Nome da Rua).</w:t>
+            </w:r>
+          </w:p>
+          <w:p>
+            <w:pPr>
+              <w:numPr>
+                <w:ilvl w:val="1"/>
+                <w:numId w:val="8"/>
+              </w:numPr>
+              <w:spacing w:after="0" w:afterAutospacing="0" w:before="0" w:beforeAutospacing="0" w:line="360" w:lineRule="auto"/>
+              <w:ind w:left="1440" w:hanging="360"/>
+            </w:pPr>
+            <w:r>
+              <w:rPr>
+                <w:sz w:val="24"/>
+                <w:szCs w:val="24"/>
+                <w:rtl w:val="0"/>
+              </w:rPr>
+              <w:t xml:space="preserve">O Cliente insira o endereço.</w:t>
+            </w:r>
+          </w:p>
+          <w:p>
+            <w:pPr>
+              <w:numPr>
+                <w:ilvl w:val="1"/>
+                <w:numId w:val="8"/>
+              </w:numPr>
+              <w:spacing w:after="660" w:before="0" w:beforeAutospacing="0" w:line="360" w:lineRule="auto"/>
+              <w:ind w:left="1440" w:hanging="360"/>
+            </w:pPr>
+            <w:r>
+              <w:rPr>
+                <w:sz w:val="24"/>
+                <w:szCs w:val="24"/>
+                <w:rtl w:val="0"/>
+              </w:rPr>
+              <w:t xml:space="preserve">O sistema valida o endereço e prossegue para o passo 4 do fluxo principal</w:t>
             </w:r>
           </w:p>
         </w:tc>

</xml_diff>